<commit_message>
Test 4: verify against an independent ECDSA key; derive doc details from logs
- keygen.py --independent gives the receiver a random ECDSA key for the
  wrong-key test (a UID-derived key equals the sender's key); all four FAIL
- Table 1, IPs, tamper positions and median run now parsed from the logs
- Table 2/3/7 notes clarified; conclusion and README updated

Co-Authored-By: Claude Opus 5.5 <noreply@anthropic.com>
Claude-Session: https://claude.ai/code/session_01CwWXYS15SKWvDTqAeno1XS
</commit_message>
<xml_diff>
--- a/report/Exp08_Screenshots_2024300032.docx
+++ b/report/Exp08_Screenshots_2024300032.docx
@@ -794,7 +794,7 @@
         <w:pageBreakBefore/>
       </w:pPr>
       <w:r>
-        <w:t>Screenshot 16: Part H, Test 4: receiver makes its own key pairs and verifies with them (wrong public key)</w:t>
+        <w:t>Screenshot 16: Part H, Test 4: receiver makes its own key pairs (independent ECDSA key) - verification with the wrong public key FAILS for all four</w:t>
       </w:r>
     </w:p>
     <w:p>
@@ -804,7 +804,7 @@
       <w:r>
         <w:drawing>
           <wp:inline xmlns:a="http://schemas.openxmlformats.org/drawingml/2006/main" xmlns:pic="http://schemas.openxmlformats.org/drawingml/2006/picture">
-            <wp:extent cx="6120000" cy="7140746"/>
+            <wp:extent cx="6120000" cy="7243716"/>
             <wp:docPr id="16" name="Picture 16"/>
             <wp:cNvGraphicFramePr>
               <a:graphicFrameLocks noChangeAspect="1"/>
@@ -825,7 +825,7 @@
                   <pic:spPr>
                     <a:xfrm>
                       <a:off x="0" y="0"/>
-                      <a:ext cx="6120000" cy="7140746"/>
+                      <a:ext cx="6120000" cy="7243716"/>
                     </a:xfrm>
                     <a:prstGeom prst="rect"/>
                   </pic:spPr>

</xml_diff>